<commit_message>
docs: document npm setup
Co-Authored-By: Claude Sonnet 5.5 <noreply@anthropic.com>
</commit_message>
<xml_diff>
--- a/docs/docx/INSTALL-AND-DEPLOY.docx
+++ b/docs/docx/INSTALL-AND-DEPLOY.docx
@@ -54,6 +54,21 @@
       </w:pPr>
       <w:r>
         <w:t xml:space="preserve">Run</w:t>
+      </w:r>
+      <w:r>
+        <w:t xml:space="preserve"> </w:t>
+      </w:r>
+      <w:r>
+        <w:rPr>
+          <w:rStyle w:val="VerbatimChar"/>
+        </w:rPr>
+        <w:t xml:space="preserve">npm ci</w:t>
+      </w:r>
+      <w:r>
+        <w:t xml:space="preserve"> </w:t>
+      </w:r>
+      <w:r>
+        <w:t xml:space="preserve">once to install the locked dependencies (Node.js and npm required), then</w:t>
       </w:r>
       <w:r>
         <w:t xml:space="preserve"> </w:t>

</xml_diff>